<commit_message>
Rework Post 0 into a standalone full post about Kartika month
Per feedback, the month-of-Kartika post needed to stand on its own
(not just a teaser pointing to the lecture). Rebuild it from one
continuous opening segment of the lecture (~0:06-2:19: why the month
is special, Damodarashtaka sung daily unlike once-a-year festivals,
its origin through sage Satyavrata, and its deep meaning as meditation
on mother Yashoda's pure love) plus a short editorial closing note.
The lecture link now sits as optional "learn more" material at the
bottom rather than being the post's whole point.

Co-Authored-By: Claude Sonnet 5 <noreply@anthropic.com>
Claude-Session: https://claude.ai/code/session_0191oBghnP17rwTFx3hL6sTu
</commit_message>
<xml_diff>
--- a/posts/15_posty_VK_kartika_mesyats.docx
+++ b/posts/15_posty_VK_kartika_mesyats.docx
@@ -143,7 +143,7 @@
         <w:spacing w:after="100" w:before="200"/>
       </w:pPr>
       <w:r>
-        <w:t xml:space="preserve">Пост 0. Анонс: начинается месяц Картика (Дамодара)</w:t>
+        <w:t xml:space="preserve">Пост 0 (полноценный). Начался месяц Картика — месяц Дамодара</w:t>
       </w:r>
     </w:p>
     <w:p>
@@ -169,38 +169,79 @@
         <w:spacing w:after="60"/>
       </w:pPr>
       <w:r>
-        <w:t xml:space="preserve">Как говорит Гуру Махарадж в лекции об этом месяце: «Говорится, что подобно тому, как Кришна является высшим проявлением Господа, самой сладостной Его формой, точно так же, как Ганга является лучшей среди всех рек, — точно так же месяц Дамодара лучший среди всех месяцев этого года. И какую молитву мы поём каждый день? Дамодараштаку. Очень интересно: обычно Джанмаштами — один день в году, Радхаштами — один день в году, другие праздники — один день в году. А Дамодараштаку поют каждый день — целый месяц».</w:t>
-      </w:r>
-    </w:p>
-    <w:p>
-      <w:pPr>
-        <w:spacing w:after="80"/>
-      </w:pPr>
-    </w:p>
-    <w:p>
-      <w:pPr>
-        <w:spacing w:after="60"/>
-      </w:pPr>
-      <w:r>
-        <w:t xml:space="preserve">Весь месяц преданные по всему миру каждый день возносят эту особую молитву — медитацию на чистую любовь жителей Вриндавана к маленькому Кришне, которого мама Яшода в этот период связывает верёвкой за шалости.</w:t>
-      </w:r>
-    </w:p>
-    <w:p>
-      <w:pPr>
-        <w:spacing w:after="80"/>
-      </w:pPr>
-    </w:p>
-    <w:p>
-      <w:pPr>
-        <w:spacing w:after="60"/>
-      </w:pPr>
-      <w:r>
-        <w:t xml:space="preserve">Хотите узнать больше об истории этой молитвы, о том, почему этот месяц так дорог преданным, и услышать удивительную историю о демоне Агхасуре и о том, как сам Господь Брахма однажды попытался испытать Кришну? Смотрите полную лекцию Гуру Махараджа «О месяце Картика»:</w:t>
-      </w:r>
-    </w:p>
-    <w:p>
-      <w:pPr>
-        <w:spacing w:after="60"/>
+        <w:t xml:space="preserve">Говорится, что подобно тому, как Кришна является высшим проявлением Господа, самой сладостной Его формой, — точно так же, как Ганга является лучшей среди всех рек, — точно так же месяц Дамодара лучший среди всех месяцев этого года.</w:t>
+      </w:r>
+    </w:p>
+    <w:p>
+      <w:pPr>
+        <w:spacing w:after="80"/>
+      </w:pPr>
+    </w:p>
+    <w:p>
+      <w:pPr>
+        <w:spacing w:after="60"/>
+      </w:pPr>
+      <w:r>
+        <w:t xml:space="preserve">И какую молитву мы поём каждый день? Дамодараштаку. Очень интересно: обычно Джанмаштами — один день в году, Радхаштами — один день в году, другие праздники — один день в году. А Дамодараштаку поют каждый день — целый месяц. Это особая молитва, медитация на чистую преданность. Говорится, что Сатьяврата-муни, которому приписывается авторство этой песни, на самом деле её не придумал — эта песня просто явилась ему. Это, по сути, вечная медитация, вечная молитва, которая просто проявилась. Есть мудрецы, которые являются проводниками каких-то знаний в этот мир — они их сами не придумывают, знания просто проявляются через них свыше.</w:t>
+      </w:r>
+    </w:p>
+    <w:p>
+      <w:pPr>
+        <w:spacing w:after="80"/>
+      </w:pPr>
+    </w:p>
+    <w:p>
+      <w:pPr>
+        <w:spacing w:after="60"/>
+      </w:pPr>
+      <w:r>
+        <w:t xml:space="preserve">Эта Дамодараштака — она такая особая молитва. И, конечно, преданные очень её любят. У неё очень глубокий смысл: это медитация на чистую любовь жителей Вриндавана. Мама Яшода связывает Кришну верёвкой — кажется, что это просто детская шалость, обычная материнская забота о ребёнке. Но её ребёнок был необычным ребёнком: Его форма — сач-чид-ананда-рупа, форма вечности, знания и блаженства.</w:t>
+      </w:r>
+    </w:p>
+    <w:p>
+      <w:pPr>
+        <w:spacing w:after="80"/>
+      </w:pPr>
+    </w:p>
+    <w:p>
+      <w:pPr>
+        <w:spacing w:after="60"/>
+      </w:pPr>
+      <w:r>
+        <w:rPr>
+          <w:i/>
+          <w:iCs/>
+        </w:rPr>
+        <w:t xml:space="preserve">От редакции:</w:t>
+      </w:r>
+      <w:r>
+        <w:t xml:space="preserve"> весь этот месяц — хороший повод каждый день возвращаться мыслями к этой истории бескорыстной материнской любви — там, где, казалось бы, простая домашняя сцена оказывается медитацией на самую чистую любовь.</w:t>
+      </w:r>
+    </w:p>
+    <w:p>
+      <w:pPr>
+        <w:spacing w:after="80"/>
+      </w:pPr>
+    </w:p>
+    <w:p>
+      <w:pPr>
+        <w:pBdr>
+          <w:left w:val="single" w:color="CCCCCC" w:sz="12" w:space="8"/>
+        </w:pBdr>
+        <w:spacing w:after="60"/>
+        <w:ind w:left="480"/>
+      </w:pPr>
+      <w:r>
+        <w:t xml:space="preserve">Подробнее об истории этой молитвы, её глубоком смысле и об удивительной истории про демона Агхасуру и о том, как сам Господь Брахма однажды попытался испытать Кришну, — в полной лекции Гуру Махараджа «О месяце Картика»:</w:t>
+      </w:r>
+    </w:p>
+    <w:p>
+      <w:pPr>
+        <w:pBdr>
+          <w:left w:val="single" w:color="CCCCCC" w:sz="12" w:space="8"/>
+        </w:pBdr>
+        <w:spacing w:after="60"/>
+        <w:ind w:left="480"/>
       </w:pPr>
       <w:r>
         <w:t xml:space="preserve">🔹 YouTube: youtube.com/watch?v=Dy1YIIJzzeQ</w:t>
@@ -208,7 +249,11 @@
     </w:p>
     <w:p>
       <w:pPr>
-        <w:spacing w:after="60"/>
+        <w:pBdr>
+          <w:left w:val="single" w:color="CCCCCC" w:sz="12" w:space="8"/>
+        </w:pBdr>
+        <w:spacing w:after="60"/>
+        <w:ind w:left="480"/>
       </w:pPr>
       <w:r>
         <w:t xml:space="preserve">🔹 RuTube: rutube.ru/video/074a89d04fe2d3ec64a106f2c88d4099</w:t>
@@ -232,16 +277,23 @@
         <w:spacing w:after="60"/>
       </w:pPr>
       <w:r>
-        <w:t xml:space="preserve">🔸 Статус: даты независимо подтверждены по вайшнавскому календарю (harekrishna.ru), точное начало — </w:t>
-      </w:r>
-      <w:r>
-        <w:rPr>
-          <w:rFonts w:ascii="Consolas" w:cs="Consolas" w:eastAsia="Consolas" w:hAnsi="Consolas"/>
-        </w:rPr>
-        <w:t xml:space="preserve">[сверить по месту/линии]</w:t>
-      </w:r>
-      <w:r>
-        <w:t xml:space="preserve">. Цитата — черновик до сверки с аудио.</w:t>
+        <w:t xml:space="preserve">🔹 Лекция: «О месяце Картика» (10.10.2025, Калининград) · ссылка: youtube.com/watch?v=Dy1YIIJzzeQ · таймкод ~0:06–2:19 (один непрерывный отрезок)</w:t>
+      </w:r>
+    </w:p>
+    <w:p>
+      <w:pPr>
+        <w:spacing w:after="60"/>
+      </w:pPr>
+      <w:r>
+        <w:t xml:space="preserve">🔸 Статус: даты независимо подтверждены по вайшнавскому календарю (harekrishna.ru); цитата — черновик до сверки с аудио.</w:t>
+      </w:r>
+    </w:p>
+    <w:p>
+      <w:pPr>
+        <w:spacing w:after="60"/>
+      </w:pPr>
+      <w:r>
+        <w:t xml:space="preserve">🎯 Польза поста: косвенная — глубже раскрывает смысл месяца и самой распространённой ежедневной практики этого периода (Дамодараштаки), а не только сообщает даты.</w:t>
       </w:r>
     </w:p>
     <w:p>

</xml_diff>